<commit_message>
Minor edits to Linkedin post.
</commit_message>
<xml_diff>
--- a/TIDYTUESDAY/2025-08-12-EXTREME.WEATHER/misc/linkedin_post_copy.docx
+++ b/TIDYTUESDAY/2025-08-12-EXTREME.WEATHER/misc/linkedin_post_copy.docx
@@ -11,13 +11,40 @@
       </w:pPr>
       <w:bookmarkStart w:id="0" w:name="_Hlk203144636"/>
       <w:bookmarkStart w:id="1" w:name="_Hlk204099680"/>
-      <w:bookmarkStart w:id="2" w:name="_Hlk206017096"/>
-      <w:bookmarkStart w:id="3" w:name="_Hlk206018220"/>
+      <w:bookmarkStart w:id="2" w:name="_Hlk206018220"/>
       <w:r>
         <w:rPr>
           <w:rFonts w:ascii="Aptos" w:hAnsi="Aptos" w:cs="Apple Color Emoji"/>
         </w:rPr>
-        <w:t>This was a tough dataset to work with.</w:t>
+        <w:t xml:space="preserve">My first ever </w:t>
+      </w:r>
+      <w:proofErr w:type="spellStart"/>
+      <w:r>
+        <w:rPr>
+          <w:rFonts w:ascii="Aptos" w:hAnsi="Aptos" w:cs="Apple Color Emoji"/>
+        </w:rPr>
+        <w:t>Pydy</w:t>
+      </w:r>
+      <w:proofErr w:type="spellEnd"/>
+      <w:r>
+        <w:rPr>
+          <w:rFonts w:ascii="Aptos" w:hAnsi="Aptos" w:cs="Apple Color Emoji"/>
+        </w:rPr>
+        <w:t xml:space="preserve"> Tuesday! Our fall semester is going to be Python-</w:t>
+      </w:r>
+      <w:proofErr w:type="gramStart"/>
+      <w:r>
+        <w:rPr>
+          <w:rFonts w:ascii="Aptos" w:hAnsi="Aptos" w:cs="Apple Color Emoji"/>
+        </w:rPr>
+        <w:t>heavy</w:t>
+      </w:r>
+      <w:proofErr w:type="gramEnd"/>
+      <w:r>
+        <w:rPr>
+          <w:rFonts w:ascii="Aptos" w:hAnsi="Aptos" w:cs="Apple Color Emoji"/>
+        </w:rPr>
+        <w:t xml:space="preserve"> so this is a good time to make the switch.</w:t>
       </w:r>
     </w:p>
     <w:p>
@@ -39,109 +66,21 @@
         <w:rPr>
           <w:rFonts w:ascii="Aptos" w:hAnsi="Aptos" w:cs="Apple Color Emoji"/>
         </w:rPr>
-        <w:t>Besides the uncomfortable topic, there were only 5</w:t>
+        <w:t xml:space="preserve">This week we looked at a dataset about extreme weather events. I'm keeping it simple by doing a heatmap-style table using the great tables package. I love a beautiful table and I'm </w:t>
       </w:r>
+      <w:proofErr w:type="gramStart"/>
       <w:r>
         <w:rPr>
           <w:rFonts w:ascii="Aptos" w:hAnsi="Aptos" w:cs="Apple Color Emoji"/>
         </w:rPr>
-        <w:t>2</w:t>
+        <w:t>definitely going</w:t>
       </w:r>
+      <w:proofErr w:type="gramEnd"/>
       <w:r>
         <w:rPr>
           <w:rFonts w:ascii="Aptos" w:hAnsi="Aptos" w:cs="Apple Color Emoji"/>
         </w:rPr>
-        <w:t xml:space="preserve"> countries represented</w:t>
-      </w:r>
-      <w:r>
-        <w:rPr>
-          <w:rFonts w:ascii="Aptos" w:hAnsi="Aptos" w:cs="Apple Color Emoji"/>
-        </w:rPr>
-        <w:t xml:space="preserve"> and m</w:t>
-      </w:r>
-      <w:r>
-        <w:rPr>
-          <w:rFonts w:ascii="Aptos" w:hAnsi="Aptos" w:cs="Apple Color Emoji"/>
-        </w:rPr>
-        <w:t xml:space="preserve">any </w:t>
-      </w:r>
-      <w:r>
-        <w:rPr>
-          <w:rFonts w:ascii="Aptos" w:hAnsi="Aptos" w:cs="Apple Color Emoji"/>
-        </w:rPr>
-        <w:t>of them</w:t>
-      </w:r>
-      <w:r>
-        <w:rPr>
-          <w:rFonts w:ascii="Aptos" w:hAnsi="Aptos" w:cs="Apple Color Emoji"/>
-        </w:rPr>
-        <w:t xml:space="preserve"> ended up being filtered out due to </w:t>
-      </w:r>
-      <w:r>
-        <w:rPr>
-          <w:rFonts w:ascii="Aptos" w:hAnsi="Aptos" w:cs="Apple Color Emoji"/>
-        </w:rPr>
-        <w:t>missing</w:t>
-      </w:r>
-      <w:r>
-        <w:rPr>
-          <w:rFonts w:ascii="Aptos" w:hAnsi="Aptos" w:cs="Apple Color Emoji"/>
-        </w:rPr>
-        <w:t xml:space="preserve"> values. There </w:t>
-      </w:r>
-      <w:r>
-        <w:rPr>
-          <w:rFonts w:ascii="Aptos" w:hAnsi="Aptos" w:cs="Apple Color Emoji"/>
-        </w:rPr>
-        <w:t xml:space="preserve">also wasn’t any </w:t>
-      </w:r>
-      <w:r>
-        <w:rPr>
-          <w:rFonts w:ascii="Aptos" w:hAnsi="Aptos" w:cs="Apple Color Emoji"/>
-        </w:rPr>
-        <w:t xml:space="preserve">consistency in which years were </w:t>
-      </w:r>
-      <w:r>
-        <w:rPr>
-          <w:rFonts w:ascii="Aptos" w:hAnsi="Aptos" w:cs="Apple Color Emoji"/>
-        </w:rPr>
-        <w:t>available</w:t>
-      </w:r>
-      <w:r>
-        <w:rPr>
-          <w:rFonts w:ascii="Aptos" w:hAnsi="Aptos" w:cs="Apple Color Emoji"/>
-        </w:rPr>
-        <w:t xml:space="preserve"> for each country (some had </w:t>
-      </w:r>
-      <w:r>
-        <w:rPr>
-          <w:rFonts w:ascii="Aptos" w:hAnsi="Aptos" w:cs="Apple Color Emoji"/>
-        </w:rPr>
-        <w:t>annual</w:t>
-      </w:r>
-      <w:r>
-        <w:rPr>
-          <w:rFonts w:ascii="Aptos" w:hAnsi="Aptos" w:cs="Apple Color Emoji"/>
-        </w:rPr>
-        <w:t xml:space="preserve"> data</w:t>
-      </w:r>
-      <w:r>
-        <w:rPr>
-          <w:rFonts w:ascii="Aptos" w:hAnsi="Aptos" w:cs="Apple Color Emoji"/>
-        </w:rPr>
-        <w:t xml:space="preserve"> through 2022, others had only a couple of </w:t>
-      </w:r>
-      <w:r>
-        <w:rPr>
-          <w:rFonts w:ascii="Aptos" w:hAnsi="Aptos" w:cs="Apple Color Emoji"/>
-        </w:rPr>
-        <w:t>observations</w:t>
-      </w:r>
-      <w:r>
-        <w:rPr>
-          <w:rFonts w:ascii="Aptos" w:hAnsi="Aptos" w:cs="Apple Color Emoji"/>
-        </w:rPr>
-        <w:t>).</w:t>
+        <w:t xml:space="preserve"> to make more of these.</w:t>
       </w:r>
     </w:p>
     <w:p>
@@ -163,63 +102,7 @@
         <w:rPr>
           <w:rFonts w:ascii="Aptos" w:hAnsi="Aptos" w:cs="Apple Color Emoji"/>
         </w:rPr>
-        <w:t xml:space="preserve">I opted to take an average of </w:t>
-      </w:r>
-      <w:r>
-        <w:rPr>
-          <w:rFonts w:ascii="Aptos" w:hAnsi="Aptos" w:cs="Apple Color Emoji"/>
-        </w:rPr>
-        <w:t xml:space="preserve">the </w:t>
-      </w:r>
-      <w:proofErr w:type="gramStart"/>
-      <w:r>
-        <w:rPr>
-          <w:rFonts w:ascii="Aptos" w:hAnsi="Aptos" w:cs="Apple Color Emoji"/>
-        </w:rPr>
-        <w:t>pre</w:t>
-      </w:r>
-      <w:proofErr w:type="gramEnd"/>
-      <w:r>
-        <w:rPr>
-          <w:rFonts w:ascii="Aptos" w:hAnsi="Aptos" w:cs="Apple Color Emoji"/>
-        </w:rPr>
-        <w:t xml:space="preserve"> and post</w:t>
-      </w:r>
-      <w:r>
-        <w:rPr>
-          <w:rFonts w:ascii="Aptos" w:hAnsi="Aptos" w:cs="Apple Color Emoji"/>
-        </w:rPr>
-        <w:t xml:space="preserve">-tax Gini </w:t>
-      </w:r>
-      <w:r>
-        <w:rPr>
-          <w:rFonts w:ascii="Aptos" w:hAnsi="Aptos" w:cs="Apple Color Emoji"/>
-        </w:rPr>
-        <w:t>c</w:t>
-      </w:r>
-      <w:r>
-        <w:rPr>
-          <w:rFonts w:ascii="Aptos" w:hAnsi="Aptos" w:cs="Apple Color Emoji"/>
-        </w:rPr>
-        <w:t xml:space="preserve">oefficients </w:t>
-      </w:r>
-      <w:r>
-        <w:rPr>
-          <w:rFonts w:ascii="Aptos" w:hAnsi="Aptos" w:cs="Apple Color Emoji"/>
-        </w:rPr>
-        <w:t xml:space="preserve">for each country, but this is </w:t>
-      </w:r>
-      <w:r>
-        <w:rPr>
-          <w:rFonts w:ascii="Aptos" w:hAnsi="Aptos" w:cs="Apple Color Emoji"/>
-        </w:rPr>
-        <w:t>FAR</w:t>
-      </w:r>
-      <w:r>
-        <w:rPr>
-          <w:rFonts w:ascii="Aptos" w:hAnsi="Aptos" w:cs="Apple Color Emoji"/>
-        </w:rPr>
-        <w:t xml:space="preserve"> from a perfect solution.</w:t>
+        <w:t>Heat and flooding were unsurprisingly the top offenders for extreme weather. But who knew that "extreme sunshine" was a thing?</w:t>
       </w:r>
     </w:p>
     <w:p>
@@ -234,166 +117,10 @@
       <w:pPr>
         <w:spacing w:after="0"/>
         <w:rPr>
-          <w:rFonts w:ascii="Aptos" w:hAnsi="Aptos" w:cs="Apple Color Emoji"/>
-        </w:rPr>
-      </w:pPr>
-      <w:r>
-        <w:rPr>
-          <w:rFonts w:ascii="Aptos" w:hAnsi="Aptos" w:cs="Apple Color Emoji"/>
-        </w:rPr>
-        <w:t xml:space="preserve">You might be wondering, “What is a Gini coefficient?” It </w:t>
-      </w:r>
-      <w:r>
-        <w:rPr>
-          <w:rFonts w:ascii="Aptos" w:hAnsi="Aptos" w:cs="Apple Color Emoji"/>
-        </w:rPr>
-        <w:t>measures inequality on a scale from 0 to 1. Higher values indicate higher inequality. Inequality is measured here in terms of income before and after taxes and benefits.</w:t>
-      </w:r>
-    </w:p>
-    <w:p>
-      <w:pPr>
-        <w:spacing w:after="0"/>
-        <w:rPr>
-          <w:rFonts w:ascii="Aptos" w:hAnsi="Aptos" w:cs="Apple Color Emoji"/>
-        </w:rPr>
-      </w:pPr>
-    </w:p>
-    <w:p>
-      <w:pPr>
-        <w:spacing w:after="0"/>
-        <w:rPr>
-          <w:rFonts w:ascii="Aptos" w:hAnsi="Aptos" w:cs="Apple Color Emoji"/>
-        </w:rPr>
-      </w:pPr>
-      <w:r>
-        <w:rPr>
-          <w:rFonts w:ascii="Aptos" w:hAnsi="Aptos" w:cs="Apple Color Emoji"/>
-        </w:rPr>
-        <w:t xml:space="preserve">Visualizing this data was also tricky. I opted for a segment chart sorted on the </w:t>
-      </w:r>
-      <w:r>
-        <w:rPr>
-          <w:rFonts w:ascii="Aptos" w:hAnsi="Aptos" w:cs="Apple Color Emoji"/>
-        </w:rPr>
-        <w:t>post</w:t>
-      </w:r>
-      <w:r>
-        <w:rPr>
-          <w:rFonts w:ascii="Aptos" w:hAnsi="Aptos" w:cs="Apple Color Emoji"/>
-        </w:rPr>
-        <w:t>-tax Gini coefficient.</w:t>
-      </w:r>
-    </w:p>
-    <w:p>
-      <w:pPr>
-        <w:spacing w:after="0"/>
-        <w:rPr>
-          <w:rFonts w:ascii="Aptos" w:hAnsi="Aptos" w:cs="Apple Color Emoji"/>
-        </w:rPr>
-      </w:pPr>
-    </w:p>
-    <w:p>
-      <w:pPr>
-        <w:spacing w:after="0"/>
-        <w:rPr>
-          <w:rFonts w:ascii="Aptos" w:hAnsi="Aptos" w:cs="Apple Color Emoji"/>
-        </w:rPr>
-      </w:pPr>
-      <w:r>
-        <w:rPr>
-          <w:rFonts w:ascii="Aptos" w:hAnsi="Aptos" w:cs="Apple Color Emoji"/>
-        </w:rPr>
-        <w:t>The more obvious choice would have been to simply calculate the</w:t>
-      </w:r>
-      <w:r>
-        <w:rPr>
-          <w:rFonts w:ascii="Aptos" w:hAnsi="Aptos" w:cs="Apple Color Emoji"/>
-        </w:rPr>
-        <w:t xml:space="preserve"> difference between </w:t>
-      </w:r>
-      <w:proofErr w:type="gramStart"/>
-      <w:r>
-        <w:rPr>
-          <w:rFonts w:ascii="Aptos" w:hAnsi="Aptos" w:cs="Apple Color Emoji"/>
-        </w:rPr>
-        <w:t>pre</w:t>
-      </w:r>
-      <w:proofErr w:type="gramEnd"/>
-      <w:r>
-        <w:rPr>
-          <w:rFonts w:ascii="Aptos" w:hAnsi="Aptos" w:cs="Apple Color Emoji"/>
-        </w:rPr>
-        <w:t xml:space="preserve"> and post</w:t>
-      </w:r>
-      <w:r>
-        <w:rPr>
-          <w:rFonts w:ascii="Aptos" w:hAnsi="Aptos" w:cs="Apple Color Emoji"/>
-        </w:rPr>
-        <w:t>-</w:t>
-      </w:r>
-      <w:r>
-        <w:rPr>
-          <w:rFonts w:ascii="Aptos" w:hAnsi="Aptos" w:cs="Apple Color Emoji"/>
-        </w:rPr>
-        <w:t>tax</w:t>
-      </w:r>
-      <w:r>
-        <w:rPr>
-          <w:rFonts w:ascii="Aptos" w:hAnsi="Aptos" w:cs="Apple Color Emoji"/>
-        </w:rPr>
-        <w:t xml:space="preserve"> and plot those values using a sorted bar chart. </w:t>
-      </w:r>
-    </w:p>
-    <w:p>
-      <w:pPr>
-        <w:spacing w:after="0"/>
-        <w:rPr>
-          <w:rFonts w:ascii="Aptos" w:hAnsi="Aptos" w:cs="Apple Color Emoji"/>
-        </w:rPr>
-      </w:pPr>
-    </w:p>
-    <w:p>
-      <w:pPr>
-        <w:spacing w:after="0"/>
-        <w:rPr>
-          <w:rFonts w:ascii="Aptos" w:hAnsi="Aptos" w:cs="Apple Color Emoji"/>
-        </w:rPr>
-      </w:pPr>
-      <w:r>
-        <w:rPr>
-          <w:rFonts w:ascii="Aptos" w:hAnsi="Aptos" w:cs="Apple Color Emoji"/>
-        </w:rPr>
-        <w:t>But that wouldn’t have been</w:t>
-      </w:r>
-      <w:r>
-        <w:rPr>
-          <w:rFonts w:ascii="Aptos" w:hAnsi="Aptos" w:cs="Apple Color Emoji"/>
-        </w:rPr>
-        <w:t xml:space="preserve"> nearly</w:t>
-      </w:r>
-      <w:r>
-        <w:rPr>
-          <w:rFonts w:ascii="Aptos" w:hAnsi="Aptos" w:cs="Apple Color Emoji"/>
-        </w:rPr>
-        <w:t xml:space="preserve"> as fun!</w:t>
-      </w:r>
-    </w:p>
-    <w:bookmarkEnd w:id="2"/>
-    <w:p>
-      <w:pPr>
-        <w:spacing w:after="0"/>
-        <w:rPr>
-          <w:rFonts w:ascii="Aptos" w:hAnsi="Aptos" w:cs="Apple Color Emoji"/>
-        </w:rPr>
-      </w:pPr>
-    </w:p>
-    <w:p>
-      <w:pPr>
-        <w:spacing w:after="0"/>
-        <w:rPr>
           <w:rFonts w:ascii="Aptos" w:hAnsi="Aptos"/>
         </w:rPr>
       </w:pPr>
+      <w:bookmarkStart w:id="3" w:name="_Hlk206444803"/>
       <w:r>
         <w:rPr>
           <w:rFonts w:ascii="Aptos" w:hAnsi="Aptos"/>
@@ -410,10 +137,35 @@
           <w:rPr>
             <w:rStyle w:val="Hyperlink"/>
           </w:rPr>
-          <w:t>https://stevenvillalon.github.io/portfolio/TIDYTUESDAY/2025-08-05-INEQUALITY/2025-08-05_tidy_tuesday_inequality_O.html</w:t>
+          <w:t>https://stevenvillalon.g</w:t>
+        </w:r>
+        <w:r>
+          <w:rPr>
+            <w:rStyle w:val="Hyperlink"/>
+          </w:rPr>
+          <w:t>i</w:t>
+        </w:r>
+        <w:r>
+          <w:rPr>
+            <w:rStyle w:val="Hyperlink"/>
+          </w:rPr>
+          <w:t>thub.io/portfolio/TIDYTUESDAY/2025-08-12-EXTREME.WEATHER/2025-08-12_tidy_tuesday_e</w:t>
+        </w:r>
+        <w:r>
+          <w:rPr>
+            <w:rStyle w:val="Hyperlink"/>
+          </w:rPr>
+          <w:t>x</w:t>
+        </w:r>
+        <w:r>
+          <w:rPr>
+            <w:rStyle w:val="Hyperlink"/>
+          </w:rPr>
+          <w:t>treme_weather_O.html</w:t>
         </w:r>
       </w:hyperlink>
     </w:p>
+    <w:bookmarkEnd w:id="3"/>
     <w:p>
       <w:pPr>
         <w:spacing w:after="0"/>
@@ -423,26 +175,28 @@
       </w:pPr>
     </w:p>
     <w:bookmarkEnd w:id="0"/>
+    <w:bookmarkEnd w:id="1"/>
+    <w:bookmarkEnd w:id="2"/>
     <w:p>
       <w:pPr>
+        <w:spacing w:after="0"/>
+        <w:rPr>
+          <w:rFonts w:ascii="Aptos" w:hAnsi="Aptos" w:cs="Apple Color Emoji"/>
+        </w:rPr>
+      </w:pPr>
+      <w:r>
+        <w:rPr>
+          <w:rFonts w:ascii="Aptos" w:hAnsi="Aptos" w:cs="Apple Color Emoji"/>
+        </w:rPr>
+        <w:t>#PydyTuesday #DataScience #DataViz #PortfolioProject #NDDS #NotreDame #TidyTuesday</w:t>
+      </w:r>
+    </w:p>
+    <w:p>
+      <w:pPr>
         <w:rPr>
           <w:rFonts w:ascii="Aptos" w:hAnsi="Aptos"/>
         </w:rPr>
       </w:pPr>
-      <w:r>
-        <w:rPr>
-          <w:rFonts w:ascii="Aptos" w:hAnsi="Aptos"/>
-        </w:rPr>
-        <w:t>#RStats #TidyTuesday #DataScience #DataViz</w:t>
-      </w:r>
-      <w:bookmarkEnd w:id="1"/>
-      <w:r>
-        <w:rPr>
-          <w:rFonts w:ascii="Aptos" w:hAnsi="Aptos"/>
-        </w:rPr>
-        <w:t xml:space="preserve"> #Statistics</w:t>
-      </w:r>
-      <w:bookmarkEnd w:id="3"/>
     </w:p>
     <w:sectPr>
       <w:pgSz w:w="12240" w:h="15840"/>
@@ -1637,6 +1391,18 @@
       <w14:ligatures w14:val="none"/>
     </w:rPr>
   </w:style>
+  <w:style w:type="character" w:styleId="FollowedHyperlink">
+    <w:name w:val="FollowedHyperlink"/>
+    <w:basedOn w:val="DefaultParagraphFont"/>
+    <w:uiPriority w:val="99"/>
+    <w:semiHidden/>
+    <w:unhideWhenUsed/>
+    <w:rsid w:val="00284CBC"/>
+    <w:rPr>
+      <w:color w:val="96607D" w:themeColor="followedHyperlink"/>
+      <w:u w:val="single"/>
+    </w:rPr>
+  </w:style>
 </w:styles>
 </file>
 

</xml_diff>